<commit_message>
Update letterhead title to Associate Professor and Associate Dept Head
Claude-Session: https://claude.ai/code/session_01FU32JMKcmZhLsf3161c62Q
</commit_message>
<xml_diff>
--- a/templates/letterhead.docx
+++ b/templates/letterhead.docx
@@ -608,7 +608,7 @@
           <w:sz w:val="22"/>
           <w:szCs w:val="22"/>
         </w:rPr>
-        <w:t>Assistant Professor | Director of the Heritage 3D lab</w:t>
+        <w:t>Associate Professor | Director of the Heritage 3D Lab</w:t>
       </w:r>
     </w:p>
     <w:p>
@@ -627,34 +627,7 @@
           <w:sz w:val="22"/>
           <w:szCs w:val="22"/>
         </w:rPr>
-        <w:t>Department of Architectural Engineering</w:t>
-      </w:r>
-      <w:r>
-        <w:rPr>
-          <w:rFonts w:ascii="Aptos" w:eastAsia="Times" w:hAnsi="Aptos" w:cs="Times"/>
-          <w:color w:val="000000" w:themeColor="text1"/>
-          <w:sz w:val="22"/>
-          <w:szCs w:val="22"/>
-        </w:rPr>
-        <w:t xml:space="preserve"> | The Pennsylvania</w:t>
-      </w:r>
-      <w:r>
-        <w:rPr>
-          <w:rFonts w:ascii="Aptos" w:eastAsia="Times" w:hAnsi="Aptos" w:cs="Times"/>
-          <w:color w:val="000000" w:themeColor="text1"/>
-          <w:sz w:val="22"/>
-          <w:szCs w:val="22"/>
-        </w:rPr>
-        <w:t xml:space="preserve"> State Universit</w:t>
-      </w:r>
-      <w:r>
-        <w:rPr>
-          <w:rFonts w:ascii="Aptos" w:eastAsia="Times" w:hAnsi="Aptos" w:cs="Times"/>
-          <w:color w:val="000000" w:themeColor="text1"/>
-          <w:sz w:val="22"/>
-          <w:szCs w:val="22"/>
-        </w:rPr>
-        <w:t>y</w:t>
+        <w:t xml:space="preserve">Associate Dept Head | Dept of Architectural Engineering | The Pennsylvania State University</w:t>
       </w:r>
     </w:p>
     <w:sectPr>

</xml_diff>